<commit_message>
A javaslat kifejezetten nem minősíti jogsértőnek a mai gyakorlatot
A 8.3 szerinti besorolás néhol szűkebb annál, mint amit a hivatalos felület ma
megjelenít. Ebből olvasható lenne az az állítás, hogy a jelenlegi működés
jogsértő. Nem az, és nem is a mi dolgunk eldönteni.

A „Mit nem állítunk" lista új pontja kimondja: a javaslat új csatornára vonatkozó
szabályozást kér, nem a hatályos gyakorlat minősítését, és a szűkítés indoka az,
hogy az automatizált, ismételt lekérdezés más kitettséget jelent, mint az
alkalmi kézi megtekintés. A megítélés az adatvédelmi hatóság és a bíróság
hatásköre.

A katalógus 4.4 pontja ugyanezt mondja ki az osztályátlagra. Egy valódi
aggregátum jellemzően nem személyes adat, és ahol mégis azzá válhat, ott sem
következik automatikusan a jogellenesség.

Co-Authored-By: Claude Opus 5 <noreply@anthropic.com>
Claude-Session: https://claude.ai/code/session_014aQq53hk1s8SESmduMDC8u
</commit_message>
<xml_diff>
--- a/eloterjesztes/AI-Orszag-sajat-oktatasi-adat.docx
+++ b/eloterjesztes/AI-Orszag-sajat-oktatasi-adat.docx
@@ -358,6 +358,36 @@
       </w:r>
       <w:r>
         <w:t xml:space="preserve"> A 8. fejezet ennek az ellenkezőjét javasolja.</w:t>
+      </w:r>
+    </w:p>
+    <w:p>
+      <w:pPr>
+        <w:pStyle w:val="ListParagraph"/>
+        <w:numPr>
+          <w:ilvl w:val="0"/>
+          <w:numId w:val="1"/>
+        </w:numPr>
+        <w:spacing w:after="60"/>
+      </w:pPr>
+      <w:r>
+        <w:rPr>
+          <w:b/>
+          <w:bCs/>
+        </w:rPr>
+        <w:t xml:space="preserve">Nem állítjuk, hogy a rendszerek jelenlegi működése jogsértő.</w:t>
+      </w:r>
+      <w:r>
+        <w:t xml:space="preserve"> A javaslat egy új csatornára vonatkozó szabályozást kér, nem a hatályos gyakorlat minősítését. Ahol a 8.3 szerinti besorolás szűkebb annál, mint amit a hivatalos felület ma megjelenít, az azért van, mert </w:t>
+      </w:r>
+      <w:r>
+        <w:rPr>
+          <w:b/>
+          <w:bCs/>
+        </w:rPr>
+        <w:t xml:space="preserve">az automatizált, ismételt lekérdezés más kitettséget jelent, mint az alkalmi kézi megtekintés</w:t>
+      </w:r>
+      <w:r>
+        <w:t xml:space="preserve"> — nem azért, mert a mai megjelenítést jogellenesnek tartanánk. Ennek megítélése az adatvédelmi hatóság és a bíróság hatásköre.</w:t>
       </w:r>
     </w:p>
     <w:p>

</xml_diff>